<commit_message>
Scope the purchase justification to the NAS chassis only
Drop the drive, memory and SSD line items from the cost breakdown and
state that storage media are outside this application, using existing
assets instead. Update the quantity and estimate fields to match.

Also resolve docx via normal module resolution instead of a hardcoded
node_modules path, so the documented rebuild step works.

Co-Authored-By: Claude Opus 5 <noreply@anthropic.com>
Claude-Session: https://claude.ai/code/session_01By6MHr44dq3tmSy4vQnyDn
</commit_message>
<xml_diff>
--- a/docs/物品購入理由書_UGREEN_DXP4800Plus.docx
+++ b/docs/物品購入理由書_UGREEN_DXP4800Plus.docx
@@ -477,7 +477,7 @@
                 <w:sz w:val="19"/>
                 <w:szCs w:val="19"/>
               </w:rPr>
-              <w:t xml:space="preserve">1式（本体1台＋内蔵HDD 4台）</w:t>
+              <w:t xml:space="preserve">1台（本体のみ）</w:t>
             </w:r>
           </w:p>
         </w:tc>
@@ -539,7 +539,7 @@
                 <w:sz w:val="19"/>
                 <w:szCs w:val="19"/>
               </w:rPr>
-              <w:t xml:space="preserve">　　　　　　　円（内訳は「7. 経費内訳」参照）</w:t>
+              <w:t xml:space="preserve">　　　　　　　円（本体のみ。内訳は「7. 経費内訳」参照）</w:t>
             </w:r>
           </w:p>
         </w:tc>
@@ -2370,7 +2370,7 @@
                 <w:sz w:val="19"/>
                 <w:szCs w:val="19"/>
               </w:rPr>
-              <w:t xml:space="preserve">UGREEN NASync DXP4800 Plus（4ベイ、ディスクレス）</w:t>
+              <w:t xml:space="preserve">UGREEN NASync DXP4800 Plus（4ベイ）</w:t>
             </w:r>
           </w:p>
         </w:tc>
@@ -2466,441 +2466,6 @@
         <w:tc>
           <w:tcPr>
             <w:tcW w:type="dxa" w:w="1900"/>
-            <w:tcMar>
-              <w:top w:type="dxa" w:w="60"/>
-              <w:left w:type="dxa" w:w="108"/>
-              <w:bottom w:type="dxa" w:w="60"/>
-              <w:right w:type="dxa" w:w="108"/>
-            </w:tcMar>
-            <w:vAlign w:val="center"/>
-          </w:tcPr>
-          <w:p>
-            <w:pPr>
-              <w:spacing w:after="30" w:before="30" w:line="250" w:lineRule="auto"/>
-              <w:jc w:val="left"/>
-            </w:pPr>
-            <w:r>
-              <w:rPr>
-                <w:rFonts w:ascii="ＭＳ 明朝" w:cs="ＭＳ 明朝" w:eastAsia="ＭＳ 明朝" w:hAnsi="ＭＳ 明朝"/>
-                <w:b w:val="false"/>
-                <w:bCs w:val="false"/>
-                <w:sz w:val="19"/>
-                <w:szCs w:val="19"/>
-              </w:rPr>
-              <w:t xml:space="preserve">内蔵HDD</w:t>
-            </w:r>
-          </w:p>
-        </w:tc>
-        <w:tc>
-          <w:tcPr>
-            <w:tcW w:type="dxa" w:w="3138"/>
-            <w:tcMar>
-              <w:top w:type="dxa" w:w="60"/>
-              <w:left w:type="dxa" w:w="108"/>
-              <w:bottom w:type="dxa" w:w="60"/>
-              <w:right w:type="dxa" w:w="108"/>
-            </w:tcMar>
-            <w:vAlign w:val="center"/>
-          </w:tcPr>
-          <w:p>
-            <w:pPr>
-              <w:spacing w:after="30" w:before="30" w:line="250" w:lineRule="auto"/>
-              <w:jc w:val="left"/>
-            </w:pPr>
-            <w:r>
-              <w:rPr>
-                <w:rFonts w:ascii="ＭＳ 明朝" w:cs="ＭＳ 明朝" w:eastAsia="ＭＳ 明朝" w:hAnsi="ＭＳ 明朝"/>
-                <w:b w:val="false"/>
-                <w:bCs w:val="false"/>
-                <w:sz w:val="19"/>
-                <w:szCs w:val="19"/>
-              </w:rPr>
-              <w:t xml:space="preserve">NAS用 3.5インチHDD（　　TB）</w:t>
-            </w:r>
-          </w:p>
-        </w:tc>
-        <w:tc>
-          <w:tcPr>
-            <w:tcW w:type="dxa" w:w="900"/>
-            <w:tcMar>
-              <w:top w:type="dxa" w:w="60"/>
-              <w:left w:type="dxa" w:w="108"/>
-              <w:bottom w:type="dxa" w:w="60"/>
-              <w:right w:type="dxa" w:w="108"/>
-            </w:tcMar>
-            <w:vAlign w:val="center"/>
-          </w:tcPr>
-          <w:p>
-            <w:pPr>
-              <w:spacing w:after="30" w:before="30" w:line="250" w:lineRule="auto"/>
-              <w:jc w:val="center"/>
-            </w:pPr>
-            <w:r>
-              <w:rPr>
-                <w:rFonts w:ascii="ＭＳ 明朝" w:cs="ＭＳ 明朝" w:eastAsia="ＭＳ 明朝" w:hAnsi="ＭＳ 明朝"/>
-                <w:b w:val="false"/>
-                <w:bCs w:val="false"/>
-                <w:sz w:val="19"/>
-                <w:szCs w:val="19"/>
-              </w:rPr>
-              <w:t xml:space="preserve">4台</w:t>
-            </w:r>
-          </w:p>
-        </w:tc>
-        <w:tc>
-          <w:tcPr>
-            <w:tcW w:type="dxa" w:w="1850"/>
-            <w:tcMar>
-              <w:top w:type="dxa" w:w="60"/>
-              <w:left w:type="dxa" w:w="108"/>
-              <w:bottom w:type="dxa" w:w="60"/>
-              <w:right w:type="dxa" w:w="108"/>
-            </w:tcMar>
-            <w:vAlign w:val="center"/>
-          </w:tcPr>
-          <w:p>
-            <w:pPr>
-              <w:spacing w:after="30" w:before="30" w:line="250" w:lineRule="auto"/>
-              <w:jc w:val="center"/>
-            </w:pPr>
-            <w:r>
-              <w:rPr>
-                <w:rFonts w:ascii="ＭＳ 明朝" w:cs="ＭＳ 明朝" w:eastAsia="ＭＳ 明朝" w:hAnsi="ＭＳ 明朝"/>
-                <w:b w:val="false"/>
-                <w:bCs w:val="false"/>
-                <w:sz w:val="19"/>
-                <w:szCs w:val="19"/>
-              </w:rPr>
-              <w:t xml:space="preserve"/>
-            </w:r>
-          </w:p>
-        </w:tc>
-        <w:tc>
-          <w:tcPr>
-            <w:tcW w:type="dxa" w:w="1850"/>
-            <w:tcMar>
-              <w:top w:type="dxa" w:w="60"/>
-              <w:left w:type="dxa" w:w="108"/>
-              <w:bottom w:type="dxa" w:w="60"/>
-              <w:right w:type="dxa" w:w="108"/>
-            </w:tcMar>
-            <w:vAlign w:val="center"/>
-          </w:tcPr>
-          <w:p>
-            <w:pPr>
-              <w:spacing w:after="30" w:before="30" w:line="250" w:lineRule="auto"/>
-              <w:jc w:val="center"/>
-            </w:pPr>
-            <w:r>
-              <w:rPr>
-                <w:rFonts w:ascii="ＭＳ 明朝" w:cs="ＭＳ 明朝" w:eastAsia="ＭＳ 明朝" w:hAnsi="ＭＳ 明朝"/>
-                <w:b w:val="false"/>
-                <w:bCs w:val="false"/>
-                <w:sz w:val="19"/>
-                <w:szCs w:val="19"/>
-              </w:rPr>
-              <w:t xml:space="preserve"/>
-            </w:r>
-          </w:p>
-        </w:tc>
-      </w:tr>
-      <w:tr>
-        <w:trPr>
-          <w:cantSplit/>
-        </w:trPr>
-        <w:tc>
-          <w:tcPr>
-            <w:tcW w:type="dxa" w:w="1900"/>
-            <w:tcMar>
-              <w:top w:type="dxa" w:w="60"/>
-              <w:left w:type="dxa" w:w="108"/>
-              <w:bottom w:type="dxa" w:w="60"/>
-              <w:right w:type="dxa" w:w="108"/>
-            </w:tcMar>
-            <w:vAlign w:val="center"/>
-          </w:tcPr>
-          <w:p>
-            <w:pPr>
-              <w:spacing w:after="30" w:before="30" w:line="250" w:lineRule="auto"/>
-              <w:jc w:val="left"/>
-            </w:pPr>
-            <w:r>
-              <w:rPr>
-                <w:rFonts w:ascii="ＭＳ 明朝" w:cs="ＭＳ 明朝" w:eastAsia="ＭＳ 明朝" w:hAnsi="ＭＳ 明朝"/>
-                <w:b w:val="false"/>
-                <w:bCs w:val="false"/>
-                <w:sz w:val="19"/>
-                <w:szCs w:val="19"/>
-              </w:rPr>
-              <w:t xml:space="preserve">増設メモリ</w:t>
-            </w:r>
-          </w:p>
-        </w:tc>
-        <w:tc>
-          <w:tcPr>
-            <w:tcW w:type="dxa" w:w="3138"/>
-            <w:tcMar>
-              <w:top w:type="dxa" w:w="60"/>
-              <w:left w:type="dxa" w:w="108"/>
-              <w:bottom w:type="dxa" w:w="60"/>
-              <w:right w:type="dxa" w:w="108"/>
-            </w:tcMar>
-            <w:vAlign w:val="center"/>
-          </w:tcPr>
-          <w:p>
-            <w:pPr>
-              <w:spacing w:after="30" w:before="30" w:line="250" w:lineRule="auto"/>
-              <w:jc w:val="left"/>
-            </w:pPr>
-            <w:r>
-              <w:rPr>
-                <w:rFonts w:ascii="ＭＳ 明朝" w:cs="ＭＳ 明朝" w:eastAsia="ＭＳ 明朝" w:hAnsi="ＭＳ 明朝"/>
-                <w:b w:val="false"/>
-                <w:bCs w:val="false"/>
-                <w:sz w:val="19"/>
-                <w:szCs w:val="19"/>
-              </w:rPr>
-              <w:t xml:space="preserve">DDR5 SO-DIMM（　　GB）</w:t>
-            </w:r>
-          </w:p>
-        </w:tc>
-        <w:tc>
-          <w:tcPr>
-            <w:tcW w:type="dxa" w:w="900"/>
-            <w:tcMar>
-              <w:top w:type="dxa" w:w="60"/>
-              <w:left w:type="dxa" w:w="108"/>
-              <w:bottom w:type="dxa" w:w="60"/>
-              <w:right w:type="dxa" w:w="108"/>
-            </w:tcMar>
-            <w:vAlign w:val="center"/>
-          </w:tcPr>
-          <w:p>
-            <w:pPr>
-              <w:spacing w:after="30" w:before="30" w:line="250" w:lineRule="auto"/>
-              <w:jc w:val="center"/>
-            </w:pPr>
-            <w:r>
-              <w:rPr>
-                <w:rFonts w:ascii="ＭＳ 明朝" w:cs="ＭＳ 明朝" w:eastAsia="ＭＳ 明朝" w:hAnsi="ＭＳ 明朝"/>
-                <w:b w:val="false"/>
-                <w:bCs w:val="false"/>
-                <w:sz w:val="19"/>
-                <w:szCs w:val="19"/>
-              </w:rPr>
-              <w:t xml:space="preserve">　枚</w:t>
-            </w:r>
-          </w:p>
-        </w:tc>
-        <w:tc>
-          <w:tcPr>
-            <w:tcW w:type="dxa" w:w="1850"/>
-            <w:tcMar>
-              <w:top w:type="dxa" w:w="60"/>
-              <w:left w:type="dxa" w:w="108"/>
-              <w:bottom w:type="dxa" w:w="60"/>
-              <w:right w:type="dxa" w:w="108"/>
-            </w:tcMar>
-            <w:vAlign w:val="center"/>
-          </w:tcPr>
-          <w:p>
-            <w:pPr>
-              <w:spacing w:after="30" w:before="30" w:line="250" w:lineRule="auto"/>
-              <w:jc w:val="center"/>
-            </w:pPr>
-            <w:r>
-              <w:rPr>
-                <w:rFonts w:ascii="ＭＳ 明朝" w:cs="ＭＳ 明朝" w:eastAsia="ＭＳ 明朝" w:hAnsi="ＭＳ 明朝"/>
-                <w:b w:val="false"/>
-                <w:bCs w:val="false"/>
-                <w:sz w:val="19"/>
-                <w:szCs w:val="19"/>
-              </w:rPr>
-              <w:t xml:space="preserve"/>
-            </w:r>
-          </w:p>
-        </w:tc>
-        <w:tc>
-          <w:tcPr>
-            <w:tcW w:type="dxa" w:w="1850"/>
-            <w:tcMar>
-              <w:top w:type="dxa" w:w="60"/>
-              <w:left w:type="dxa" w:w="108"/>
-              <w:bottom w:type="dxa" w:w="60"/>
-              <w:right w:type="dxa" w:w="108"/>
-            </w:tcMar>
-            <w:vAlign w:val="center"/>
-          </w:tcPr>
-          <w:p>
-            <w:pPr>
-              <w:spacing w:after="30" w:before="30" w:line="250" w:lineRule="auto"/>
-              <w:jc w:val="center"/>
-            </w:pPr>
-            <w:r>
-              <w:rPr>
-                <w:rFonts w:ascii="ＭＳ 明朝" w:cs="ＭＳ 明朝" w:eastAsia="ＭＳ 明朝" w:hAnsi="ＭＳ 明朝"/>
-                <w:b w:val="false"/>
-                <w:bCs w:val="false"/>
-                <w:sz w:val="19"/>
-                <w:szCs w:val="19"/>
-              </w:rPr>
-              <w:t xml:space="preserve"/>
-            </w:r>
-          </w:p>
-        </w:tc>
-      </w:tr>
-      <w:tr>
-        <w:trPr>
-          <w:cantSplit/>
-        </w:trPr>
-        <w:tc>
-          <w:tcPr>
-            <w:tcW w:type="dxa" w:w="1900"/>
-            <w:tcMar>
-              <w:top w:type="dxa" w:w="60"/>
-              <w:left w:type="dxa" w:w="108"/>
-              <w:bottom w:type="dxa" w:w="60"/>
-              <w:right w:type="dxa" w:w="108"/>
-            </w:tcMar>
-            <w:vAlign w:val="center"/>
-          </w:tcPr>
-          <w:p>
-            <w:pPr>
-              <w:spacing w:after="30" w:before="30" w:line="250" w:lineRule="auto"/>
-              <w:jc w:val="left"/>
-            </w:pPr>
-            <w:r>
-              <w:rPr>
-                <w:rFonts w:ascii="ＭＳ 明朝" w:cs="ＭＳ 明朝" w:eastAsia="ＭＳ 明朝" w:hAnsi="ＭＳ 明朝"/>
-                <w:b w:val="false"/>
-                <w:bCs w:val="false"/>
-                <w:sz w:val="19"/>
-                <w:szCs w:val="19"/>
-              </w:rPr>
-              <w:t xml:space="preserve">M.2 NVMe SSD</w:t>
-            </w:r>
-          </w:p>
-        </w:tc>
-        <w:tc>
-          <w:tcPr>
-            <w:tcW w:type="dxa" w:w="3138"/>
-            <w:tcMar>
-              <w:top w:type="dxa" w:w="60"/>
-              <w:left w:type="dxa" w:w="108"/>
-              <w:bottom w:type="dxa" w:w="60"/>
-              <w:right w:type="dxa" w:w="108"/>
-            </w:tcMar>
-            <w:vAlign w:val="center"/>
-          </w:tcPr>
-          <w:p>
-            <w:pPr>
-              <w:spacing w:after="30" w:before="30" w:line="250" w:lineRule="auto"/>
-              <w:jc w:val="left"/>
-            </w:pPr>
-            <w:r>
-              <w:rPr>
-                <w:rFonts w:ascii="ＭＳ 明朝" w:cs="ＭＳ 明朝" w:eastAsia="ＭＳ 明朝" w:hAnsi="ＭＳ 明朝"/>
-                <w:b w:val="false"/>
-                <w:bCs w:val="false"/>
-                <w:sz w:val="19"/>
-                <w:szCs w:val="19"/>
-              </w:rPr>
-              <w:t xml:space="preserve">キャッシュ／作業領域用（　　TB）</w:t>
-            </w:r>
-          </w:p>
-        </w:tc>
-        <w:tc>
-          <w:tcPr>
-            <w:tcW w:type="dxa" w:w="900"/>
-            <w:tcMar>
-              <w:top w:type="dxa" w:w="60"/>
-              <w:left w:type="dxa" w:w="108"/>
-              <w:bottom w:type="dxa" w:w="60"/>
-              <w:right w:type="dxa" w:w="108"/>
-            </w:tcMar>
-            <w:vAlign w:val="center"/>
-          </w:tcPr>
-          <w:p>
-            <w:pPr>
-              <w:spacing w:after="30" w:before="30" w:line="250" w:lineRule="auto"/>
-              <w:jc w:val="center"/>
-            </w:pPr>
-            <w:r>
-              <w:rPr>
-                <w:rFonts w:ascii="ＭＳ 明朝" w:cs="ＭＳ 明朝" w:eastAsia="ＭＳ 明朝" w:hAnsi="ＭＳ 明朝"/>
-                <w:b w:val="false"/>
-                <w:bCs w:val="false"/>
-                <w:sz w:val="19"/>
-                <w:szCs w:val="19"/>
-              </w:rPr>
-              <w:t xml:space="preserve">　枚</w:t>
-            </w:r>
-          </w:p>
-        </w:tc>
-        <w:tc>
-          <w:tcPr>
-            <w:tcW w:type="dxa" w:w="1850"/>
-            <w:tcMar>
-              <w:top w:type="dxa" w:w="60"/>
-              <w:left w:type="dxa" w:w="108"/>
-              <w:bottom w:type="dxa" w:w="60"/>
-              <w:right w:type="dxa" w:w="108"/>
-            </w:tcMar>
-            <w:vAlign w:val="center"/>
-          </w:tcPr>
-          <w:p>
-            <w:pPr>
-              <w:spacing w:after="30" w:before="30" w:line="250" w:lineRule="auto"/>
-              <w:jc w:val="center"/>
-            </w:pPr>
-            <w:r>
-              <w:rPr>
-                <w:rFonts w:ascii="ＭＳ 明朝" w:cs="ＭＳ 明朝" w:eastAsia="ＭＳ 明朝" w:hAnsi="ＭＳ 明朝"/>
-                <w:b w:val="false"/>
-                <w:bCs w:val="false"/>
-                <w:sz w:val="19"/>
-                <w:szCs w:val="19"/>
-              </w:rPr>
-              <w:t xml:space="preserve"/>
-            </w:r>
-          </w:p>
-        </w:tc>
-        <w:tc>
-          <w:tcPr>
-            <w:tcW w:type="dxa" w:w="1850"/>
-            <w:tcMar>
-              <w:top w:type="dxa" w:w="60"/>
-              <w:left w:type="dxa" w:w="108"/>
-              <w:bottom w:type="dxa" w:w="60"/>
-              <w:right w:type="dxa" w:w="108"/>
-            </w:tcMar>
-            <w:vAlign w:val="center"/>
-          </w:tcPr>
-          <w:p>
-            <w:pPr>
-              <w:spacing w:after="30" w:before="30" w:line="250" w:lineRule="auto"/>
-              <w:jc w:val="center"/>
-            </w:pPr>
-            <w:r>
-              <w:rPr>
-                <w:rFonts w:ascii="ＭＳ 明朝" w:cs="ＭＳ 明朝" w:eastAsia="ＭＳ 明朝" w:hAnsi="ＭＳ 明朝"/>
-                <w:b w:val="false"/>
-                <w:bCs w:val="false"/>
-                <w:sz w:val="19"/>
-                <w:szCs w:val="19"/>
-              </w:rPr>
-              <w:t xml:space="preserve"/>
-            </w:r>
-          </w:p>
-        </w:tc>
-      </w:tr>
-      <w:tr>
-        <w:trPr>
-          <w:cantSplit/>
-        </w:trPr>
-        <w:tc>
-          <w:tcPr>
-            <w:tcW w:type="dxa" w:w="1900"/>
             <w:shd w:fill="EDEDED" w:color="auto" w:val="clear"/>
             <w:tcMar>
               <w:top w:type="dxa" w:w="60"/>
@@ -3061,7 +2626,7 @@
           <w:sz w:val="19"/>
           <w:szCs w:val="19"/>
         </w:rPr>
-        <w:t xml:space="preserve">※ 本体はディスクレス製品のため、内蔵HDDを併せて購入する必要がある。</w:t>
+        <w:t xml:space="preserve">※ 本申請は本体のみの購入であり、内蔵HDD等の記録媒体は本申請に含まない。</w:t>
       </w:r>
     </w:p>
     <w:p>
@@ -3075,7 +2640,7 @@
           <w:sz w:val="19"/>
           <w:szCs w:val="19"/>
         </w:rPr>
-        <w:t xml:space="preserve">※ RAID5構成により、実効容量は　　TB程度となる見込みである。</w:t>
+        <w:t xml:space="preserve">※ 記録媒体については既存の資産を用いて運用する。</w:t>
       </w:r>
     </w:p>
     <w:p>

</xml_diff>

<commit_message>
Fill in the cost breakdown from the supplier quote
Replace the placeholder amounts with the quoted figures: 86,300 JPY
before tax, 8,630 JPY consumption tax, 94,930 JPY total. Record the
supplier, quote number and date, the full model number, and the lead
time and excluded delivery/installation charges. The price-positioning
argument now cites the quoted amount instead of a street-price range.

Co-Authored-By: Claude Opus 5 <noreply@anthropic.com>
Claude-Session: https://claude.ai/code/session_01By6MHr44dq3tmSy4vQnyDn
</commit_message>
<xml_diff>
--- a/docs/物品購入理由書_UGREEN_DXP4800Plus.docx
+++ b/docs/物品購入理由書_UGREEN_DXP4800Plus.docx
@@ -415,7 +415,7 @@
                 <w:sz w:val="19"/>
                 <w:szCs w:val="19"/>
               </w:rPr>
-              <w:t xml:space="preserve">UGREEN NASync DXP4800 Plus（4ベイ／ディスクレス）</w:t>
+              <w:t xml:space="preserve">UGREEN NASync DXP4800 Plus（DXP4800PLUS／4ベイ・ディスクレスモデル）</w:t>
             </w:r>
           </w:p>
         </w:tc>
@@ -539,7 +539,69 @@
                 <w:sz w:val="19"/>
                 <w:szCs w:val="19"/>
               </w:rPr>
-              <w:t xml:space="preserve">　　　　　　　円（本体のみ。内訳は「7. 経費内訳」参照）</w:t>
+              <w:t xml:space="preserve">94,930円（税込）　※税別 86,300円＋消費税 8,630円</w:t>
+            </w:r>
+          </w:p>
+        </w:tc>
+      </w:tr>
+      <w:tr>
+        <w:trPr>
+          <w:cantSplit/>
+        </w:trPr>
+        <w:tc>
+          <w:tcPr>
+            <w:tcW w:type="dxa" w:w="2400"/>
+            <w:shd w:fill="EDEDED" w:color="auto" w:val="clear"/>
+            <w:tcMar>
+              <w:top w:type="dxa" w:w="60"/>
+              <w:left w:type="dxa" w:w="108"/>
+              <w:bottom w:type="dxa" w:w="60"/>
+              <w:right w:type="dxa" w:w="108"/>
+            </w:tcMar>
+            <w:vAlign w:val="center"/>
+          </w:tcPr>
+          <w:p>
+            <w:pPr>
+              <w:spacing w:after="30" w:before="30" w:line="250" w:lineRule="auto"/>
+              <w:jc w:val="left"/>
+            </w:pPr>
+            <w:r>
+              <w:rPr>
+                <w:rFonts w:ascii="ＭＳ ゴシック" w:cs="ＭＳ ゴシック" w:eastAsia="ＭＳ ゴシック" w:hAnsi="ＭＳ ゴシック"/>
+                <w:b w:val="false"/>
+                <w:bCs w:val="false"/>
+                <w:sz w:val="19"/>
+                <w:szCs w:val="19"/>
+              </w:rPr>
+              <w:t xml:space="preserve">見積業者</w:t>
+            </w:r>
+          </w:p>
+        </w:tc>
+        <w:tc>
+          <w:tcPr>
+            <w:tcW w:type="dxa" w:w="7238"/>
+            <w:tcMar>
+              <w:top w:type="dxa" w:w="60"/>
+              <w:left w:type="dxa" w:w="108"/>
+              <w:bottom w:type="dxa" w:w="60"/>
+              <w:right w:type="dxa" w:w="108"/>
+            </w:tcMar>
+            <w:vAlign w:val="center"/>
+          </w:tcPr>
+          <w:p>
+            <w:pPr>
+              <w:spacing w:after="30" w:before="30" w:line="250" w:lineRule="auto"/>
+              <w:jc w:val="left"/>
+            </w:pPr>
+            <w:r>
+              <w:rPr>
+                <w:rFonts w:ascii="ＭＳ 明朝" w:cs="ＭＳ 明朝" w:eastAsia="ＭＳ 明朝" w:hAnsi="ＭＳ 明朝"/>
+                <w:b w:val="false"/>
+                <w:bCs w:val="false"/>
+                <w:sz w:val="19"/>
+                <w:szCs w:val="19"/>
+              </w:rPr>
+              <w:t xml:space="preserve">双葉工機株式会社（見積書第44602号・2026年8月25日付）</w:t>
             </w:r>
           </w:p>
         </w:tc>
@@ -1602,7 +1664,7 @@
           <w:sz w:val="21"/>
           <w:szCs w:val="21"/>
         </w:rPr>
-        <w:t xml:space="preserve">同等仕様（x86系CPU・10GbE・4ベイ・メモリ増設可）の他社製NASは、本体のみで15万円〜20万円程度となる場合が多い。本機種の国内実勢価格は9万円台〜10万円程度であり、</w:t>
+        <w:t xml:space="preserve">同等仕様（x86系CPU・10GbE・4ベイ・メモリ増設可）の他社製NASは、本体のみで15万円〜20万円程度となる場合が多い。本申請の見積額は94,930円（税込）であり、</w:t>
       </w:r>
       <w:r>
         <w:rPr>
@@ -2370,7 +2432,7 @@
                 <w:sz w:val="19"/>
                 <w:szCs w:val="19"/>
               </w:rPr>
-              <w:t xml:space="preserve">UGREEN NASync DXP4800 Plus（4ベイ）</w:t>
+              <w:t xml:space="preserve">UGREEN NASync DXP4800 Plus（4ベイ・ディスクレスモデル、型番 DXP4800PLUS）</w:t>
             </w:r>
           </w:p>
         </w:tc>
@@ -2426,7 +2488,7 @@
                 <w:sz w:val="19"/>
                 <w:szCs w:val="19"/>
               </w:rPr>
-              <w:t xml:space="preserve"/>
+              <w:t xml:space="preserve">86,300円</w:t>
             </w:r>
           </w:p>
         </w:tc>
@@ -2454,7 +2516,7 @@
                 <w:sz w:val="19"/>
                 <w:szCs w:val="19"/>
               </w:rPr>
-              <w:t xml:space="preserve"/>
+              <w:t xml:space="preserve">86,300円</w:t>
             </w:r>
           </w:p>
         </w:tc>
@@ -2466,6 +2528,151 @@
         <w:tc>
           <w:tcPr>
             <w:tcW w:type="dxa" w:w="1900"/>
+            <w:tcMar>
+              <w:top w:type="dxa" w:w="60"/>
+              <w:left w:type="dxa" w:w="108"/>
+              <w:bottom w:type="dxa" w:w="60"/>
+              <w:right w:type="dxa" w:w="108"/>
+            </w:tcMar>
+            <w:vAlign w:val="center"/>
+          </w:tcPr>
+          <w:p>
+            <w:pPr>
+              <w:spacing w:after="30" w:before="30" w:line="250" w:lineRule="auto"/>
+              <w:jc w:val="left"/>
+            </w:pPr>
+            <w:r>
+              <w:rPr>
+                <w:rFonts w:ascii="ＭＳ 明朝" w:cs="ＭＳ 明朝" w:eastAsia="ＭＳ 明朝" w:hAnsi="ＭＳ 明朝"/>
+                <w:b w:val="false"/>
+                <w:bCs w:val="false"/>
+                <w:sz w:val="19"/>
+                <w:szCs w:val="19"/>
+              </w:rPr>
+              <w:t xml:space="preserve">消費税</w:t>
+            </w:r>
+          </w:p>
+        </w:tc>
+        <w:tc>
+          <w:tcPr>
+            <w:tcW w:type="dxa" w:w="3138"/>
+            <w:tcMar>
+              <w:top w:type="dxa" w:w="60"/>
+              <w:left w:type="dxa" w:w="108"/>
+              <w:bottom w:type="dxa" w:w="60"/>
+              <w:right w:type="dxa" w:w="108"/>
+            </w:tcMar>
+            <w:vAlign w:val="center"/>
+          </w:tcPr>
+          <w:p>
+            <w:pPr>
+              <w:spacing w:after="30" w:before="30" w:line="250" w:lineRule="auto"/>
+              <w:jc w:val="left"/>
+            </w:pPr>
+            <w:r>
+              <w:rPr>
+                <w:rFonts w:ascii="ＭＳ 明朝" w:cs="ＭＳ 明朝" w:eastAsia="ＭＳ 明朝" w:hAnsi="ＭＳ 明朝"/>
+                <w:b w:val="false"/>
+                <w:bCs w:val="false"/>
+                <w:sz w:val="19"/>
+                <w:szCs w:val="19"/>
+              </w:rPr>
+              <w:t xml:space="preserve">10%</w:t>
+            </w:r>
+          </w:p>
+        </w:tc>
+        <w:tc>
+          <w:tcPr>
+            <w:tcW w:type="dxa" w:w="900"/>
+            <w:tcMar>
+              <w:top w:type="dxa" w:w="60"/>
+              <w:left w:type="dxa" w:w="108"/>
+              <w:bottom w:type="dxa" w:w="60"/>
+              <w:right w:type="dxa" w:w="108"/>
+            </w:tcMar>
+            <w:vAlign w:val="center"/>
+          </w:tcPr>
+          <w:p>
+            <w:pPr>
+              <w:spacing w:after="30" w:before="30" w:line="250" w:lineRule="auto"/>
+              <w:jc w:val="center"/>
+            </w:pPr>
+            <w:r>
+              <w:rPr>
+                <w:rFonts w:ascii="ＭＳ 明朝" w:cs="ＭＳ 明朝" w:eastAsia="ＭＳ 明朝" w:hAnsi="ＭＳ 明朝"/>
+                <w:b w:val="false"/>
+                <w:bCs w:val="false"/>
+                <w:sz w:val="19"/>
+                <w:szCs w:val="19"/>
+              </w:rPr>
+              <w:t xml:space="preserve">—</w:t>
+            </w:r>
+          </w:p>
+        </w:tc>
+        <w:tc>
+          <w:tcPr>
+            <w:tcW w:type="dxa" w:w="1850"/>
+            <w:tcMar>
+              <w:top w:type="dxa" w:w="60"/>
+              <w:left w:type="dxa" w:w="108"/>
+              <w:bottom w:type="dxa" w:w="60"/>
+              <w:right w:type="dxa" w:w="108"/>
+            </w:tcMar>
+            <w:vAlign w:val="center"/>
+          </w:tcPr>
+          <w:p>
+            <w:pPr>
+              <w:spacing w:after="30" w:before="30" w:line="250" w:lineRule="auto"/>
+              <w:jc w:val="center"/>
+            </w:pPr>
+            <w:r>
+              <w:rPr>
+                <w:rFonts w:ascii="ＭＳ 明朝" w:cs="ＭＳ 明朝" w:eastAsia="ＭＳ 明朝" w:hAnsi="ＭＳ 明朝"/>
+                <w:b w:val="false"/>
+                <w:bCs w:val="false"/>
+                <w:sz w:val="19"/>
+                <w:szCs w:val="19"/>
+              </w:rPr>
+              <w:t xml:space="preserve">—</w:t>
+            </w:r>
+          </w:p>
+        </w:tc>
+        <w:tc>
+          <w:tcPr>
+            <w:tcW w:type="dxa" w:w="1850"/>
+            <w:tcMar>
+              <w:top w:type="dxa" w:w="60"/>
+              <w:left w:type="dxa" w:w="108"/>
+              <w:bottom w:type="dxa" w:w="60"/>
+              <w:right w:type="dxa" w:w="108"/>
+            </w:tcMar>
+            <w:vAlign w:val="center"/>
+          </w:tcPr>
+          <w:p>
+            <w:pPr>
+              <w:spacing w:after="30" w:before="30" w:line="250" w:lineRule="auto"/>
+              <w:jc w:val="center"/>
+            </w:pPr>
+            <w:r>
+              <w:rPr>
+                <w:rFonts w:ascii="ＭＳ 明朝" w:cs="ＭＳ 明朝" w:eastAsia="ＭＳ 明朝" w:hAnsi="ＭＳ 明朝"/>
+                <w:b w:val="false"/>
+                <w:bCs w:val="false"/>
+                <w:sz w:val="19"/>
+                <w:szCs w:val="19"/>
+              </w:rPr>
+              <w:t xml:space="preserve">8,630円</w:t>
+            </w:r>
+          </w:p>
+        </w:tc>
+      </w:tr>
+      <w:tr>
+        <w:trPr>
+          <w:cantSplit/>
+        </w:trPr>
+        <w:tc>
+          <w:tcPr>
+            <w:tcW w:type="dxa" w:w="1900"/>
             <w:shd w:fill="EDEDED" w:color="auto" w:val="clear"/>
             <w:tcMar>
               <w:top w:type="dxa" w:w="60"/>
@@ -2488,7 +2695,7 @@
                 <w:sz w:val="19"/>
                 <w:szCs w:val="19"/>
               </w:rPr>
-              <w:t xml:space="preserve">合計</w:t>
+              <w:t xml:space="preserve">合計（税込）</w:t>
             </w:r>
           </w:p>
         </w:tc>
@@ -2517,7 +2724,7 @@
                 <w:sz w:val="19"/>
                 <w:szCs w:val="19"/>
               </w:rPr>
-              <w:t xml:space="preserve"/>
+              <w:t xml:space="preserve">—</w:t>
             </w:r>
           </w:p>
         </w:tc>
@@ -2546,7 +2753,7 @@
                 <w:sz w:val="19"/>
                 <w:szCs w:val="19"/>
               </w:rPr>
-              <w:t xml:space="preserve"/>
+              <w:t xml:space="preserve">—</w:t>
             </w:r>
           </w:p>
         </w:tc>
@@ -2575,7 +2782,7 @@
                 <w:sz w:val="19"/>
                 <w:szCs w:val="19"/>
               </w:rPr>
-              <w:t xml:space="preserve"/>
+              <w:t xml:space="preserve">—</w:t>
             </w:r>
           </w:p>
         </w:tc>
@@ -2604,7 +2811,7 @@
                 <w:sz w:val="19"/>
                 <w:szCs w:val="19"/>
               </w:rPr>
-              <w:t xml:space="preserve"/>
+              <w:t xml:space="preserve">94,930円</w:t>
             </w:r>
           </w:p>
         </w:tc>
@@ -2626,7 +2833,7 @@
           <w:sz w:val="19"/>
           <w:szCs w:val="19"/>
         </w:rPr>
-        <w:t xml:space="preserve">※ 本申請は本体のみの購入であり、内蔵HDD等の記録媒体は本申請に含まない。</w:t>
+        <w:t xml:space="preserve">※ 双葉工機株式会社 見積書第44602号（2026年8月25日付）による。</w:t>
       </w:r>
     </w:p>
     <w:p>
@@ -2640,7 +2847,21 @@
           <w:sz w:val="19"/>
           <w:szCs w:val="19"/>
         </w:rPr>
-        <w:t xml:space="preserve">※ 記録媒体については既存の資産を用いて運用する。</w:t>
+        <w:t xml:space="preserve">※ 本申請は本体のみの購入であり、内蔵HDD／SSD等の記録媒体は本申請に含まない。記録媒体については既存の資産を用いて運用する。</w:t>
+      </w:r>
+    </w:p>
+    <w:p>
+      <w:pPr>
+        <w:spacing w:after="60" w:line="280" w:lineRule="auto"/>
+        <w:ind w:left="210" w:hanging="210"/>
+      </w:pPr>
+      <w:r>
+        <w:rPr>
+          <w:rFonts w:ascii="ＭＳ 明朝" w:cs="ＭＳ 明朝" w:eastAsia="ＭＳ 明朝" w:hAnsi="ＭＳ 明朝"/>
+          <w:sz w:val="19"/>
+          <w:szCs w:val="19"/>
+        </w:rPr>
+        <w:t xml:space="preserve">※ 納期は約1〜2週間。搬入・設置・調整費等は見積に含まれていない。</w:t>
       </w:r>
     </w:p>
     <w:p>

</xml_diff>